<commit_message>
Add repository URL to deliverables
</commit_message>
<xml_diff>
--- a/reports/outputs/悦行销售售后AI聊天机器人开发项目报告.docx
+++ b/reports/outputs/悦行销售售后AI聊天机器人开发项目报告.docx
@@ -594,7 +594,7 @@
                 <w:color w:val="20251F"/>
                 <w:sz w:val="20"/>
               </w:rPr>
-              <w:t>待上传 GitHub/Gitee 后填写</w:t>
+              <w:t>https://github.com/317flystudent/salescare-ai</w:t>
             </w:r>
           </w:p>
         </w:tc>
@@ -695,7 +695,7 @@
                 <w:color w:val="20251F"/>
                 <w:sz w:val="21"/>
               </w:rPr>
-              <w:t>本项目已完成可本地访问和交互的 Web 应用、后端 API、SQLite/MySQL 双模式持久化、知识库检索、演示订单查询流程与 DeepSeek API 接入代码。真实生产 URL、代码仓库地址和大模型 API Key 需要在部署和提交前由项目成员补充。</w:t>
+              <w:t>本项目已完成可本地访问和交互的 Web 应用、后端 API、SQLite/MySQL 双模式持久化、知识库检索、演示订单查询流程与 DeepSeek API 接入代码。生产环境 URL 和开源代码仓库地址已补充；DeepSeek API Key 仅通过环境变量配置，不写入代码仓库或报告正文。</w:t>
             </w:r>
           </w:p>
         </w:tc>
@@ -7693,7 +7693,7 @@
                 <w:color w:val="20251F"/>
                 <w:sz w:val="21"/>
               </w:rPr>
-              <w:t>请在部署后把报告首页的生产环境 URL 和代码仓库地址替换为真实地址；如需展示 DeepSeek 真实调用，请在演示机器上配置 DEEPSEEK_API_KEY。</w:t>
+              <w:t>报告首页已补充生产环境 URL 和代码仓库地址；如需展示 DeepSeek 真实调用，请在演示机器或云服务器环境变量中配置 DEEPSEEK_API_KEY，避免把密钥写入仓库。</w:t>
             </w:r>
           </w:p>
         </w:tc>

</xml_diff>

<commit_message>
Add GitHub evidence screenshots to report
</commit_message>
<xml_diff>
--- a/reports/outputs/悦行销售售后AI聊天机器人开发项目报告.docx
+++ b/reports/outputs/悦行销售售后AI聊天机器人开发项目报告.docx
@@ -8655,6 +8655,126 @@
         </w:drawing>
       </w:r>
     </w:p>
+    <w:p>
+      <w:pPr>
+        <w:pStyle w:val="Heading2"/>
+      </w:pPr>
+      <w:r>
+        <w:rPr>
+          <w:rFonts w:ascii="Calibri" w:hAnsi="Calibri" w:eastAsia="微软雅黑"/>
+          <w:b w:val="0"/>
+        </w:rPr>
+        <w:t>B.8 开源代码仓库上传完成</w:t>
+      </w:r>
+    </w:p>
+    <w:p>
+      <w:r>
+        <w:rPr>
+          <w:rFonts w:ascii="Calibri" w:hAnsi="Calibri" w:eastAsia="微软雅黑"/>
+          <w:b w:val="0"/>
+        </w:rPr>
+        <w:t>GitHub 仓库已成功上传项目代码，包含 backend、frontend、database、docs、reports、scripts 等核心目录，并保留两次提交记录。</w:t>
+      </w:r>
+    </w:p>
+    <w:p>
+      <w:pPr>
+        <w:jc w:val="center"/>
+      </w:pPr>
+      <w:r>
+        <w:drawing>
+          <wp:inline xmlns:a="http://schemas.openxmlformats.org/drawingml/2006/main" xmlns:pic="http://schemas.openxmlformats.org/drawingml/2006/picture">
+            <wp:extent cx="5760720" cy="4867198"/>
+            <wp:docPr id="10" name="Picture 10" title="B.8 开源代码仓库上传完成" descr="GitHub 仓库已成功上传项目代码，包含 backend、frontend、database、docs、reports、scripts 等核心目录，并保留两次提交记录。"/>
+            <wp:cNvGraphicFramePr>
+              <a:graphicFrameLocks noChangeAspect="1"/>
+            </wp:cNvGraphicFramePr>
+            <a:graphic>
+              <a:graphicData uri="http://schemas.openxmlformats.org/drawingml/2006/picture">
+                <pic:pic>
+                  <pic:nvPicPr>
+                    <pic:cNvPr id="0" name="08_github_repository_files.png"/>
+                    <pic:cNvPicPr/>
+                  </pic:nvPicPr>
+                  <pic:blipFill>
+                    <a:blip r:embed="rId20"/>
+                    <a:stretch>
+                      <a:fillRect/>
+                    </a:stretch>
+                  </pic:blipFill>
+                  <pic:spPr>
+                    <a:xfrm>
+                      <a:off x="0" y="0"/>
+                      <a:ext cx="5760720" cy="4867198"/>
+                    </a:xfrm>
+                    <a:prstGeom prst="rect"/>
+                  </pic:spPr>
+                </pic:pic>
+              </a:graphicData>
+            </a:graphic>
+          </wp:inline>
+        </w:drawing>
+      </w:r>
+    </w:p>
+    <w:p>
+      <w:pPr>
+        <w:pStyle w:val="Heading2"/>
+      </w:pPr>
+      <w:r>
+        <w:rPr>
+          <w:rFonts w:ascii="Calibri" w:hAnsi="Calibri" w:eastAsia="微软雅黑"/>
+          <w:b w:val="0"/>
+        </w:rPr>
+        <w:t>B.9 README 项目地址展示</w:t>
+      </w:r>
+    </w:p>
+    <w:p>
+      <w:r>
+        <w:rPr>
+          <w:rFonts w:ascii="Calibri" w:hAnsi="Calibri" w:eastAsia="微软雅黑"/>
+          <w:b w:val="0"/>
+        </w:rPr>
+        <w:t>仓库 README 中展示了 Web 应用生产环境 URL 与开源代码仓库地址，便于老师直接检查线上系统和源码。</w:t>
+      </w:r>
+    </w:p>
+    <w:p>
+      <w:pPr>
+        <w:jc w:val="center"/>
+      </w:pPr>
+      <w:r>
+        <w:drawing>
+          <wp:inline xmlns:a="http://schemas.openxmlformats.org/drawingml/2006/main" xmlns:pic="http://schemas.openxmlformats.org/drawingml/2006/picture">
+            <wp:extent cx="5760720" cy="5267430"/>
+            <wp:docPr id="11" name="Picture 11" title="B.9 README 项目地址展示" descr="仓库 README 中展示了 Web 应用生产环境 URL 与开源代码仓库地址，便于老师直接检查线上系统和源码。"/>
+            <wp:cNvGraphicFramePr>
+              <a:graphicFrameLocks noChangeAspect="1"/>
+            </wp:cNvGraphicFramePr>
+            <a:graphic>
+              <a:graphicData uri="http://schemas.openxmlformats.org/drawingml/2006/picture">
+                <pic:pic>
+                  <pic:nvPicPr>
+                    <pic:cNvPr id="0" name="09_github_readme_project_urls.png"/>
+                    <pic:cNvPicPr/>
+                  </pic:nvPicPr>
+                  <pic:blipFill>
+                    <a:blip r:embed="rId21"/>
+                    <a:stretch>
+                      <a:fillRect/>
+                    </a:stretch>
+                  </pic:blipFill>
+                  <pic:spPr>
+                    <a:xfrm>
+                      <a:off x="0" y="0"/>
+                      <a:ext cx="5760720" cy="5267430"/>
+                    </a:xfrm>
+                    <a:prstGeom prst="rect"/>
+                  </pic:spPr>
+                </pic:pic>
+              </a:graphicData>
+            </a:graphic>
+          </wp:inline>
+        </w:drawing>
+      </w:r>
+    </w:p>
     <w:sectPr>
       <w:headerReference w:type="default" r:id="rId9"/>
       <w:footerReference w:type="default" r:id="rId10"/>

</xml_diff>

<commit_message>
Align report with assessment requirements
</commit_message>
<xml_diff>
--- a/reports/outputs/悦行销售售后AI聊天机器人开发项目报告.docx
+++ b/reports/outputs/悦行销售售后AI聊天机器人开发项目报告.docx
@@ -334,7 +334,7 @@
                 <w:color w:val="20251F"/>
                 <w:sz w:val="20"/>
               </w:rPr>
-              <w:t>待填写</w:t>
+              <w:t>提交前请填写真实姓名、学号和小组成员</w:t>
             </w:r>
           </w:p>
         </w:tc>
@@ -1229,7 +1229,518 @@
           <w:rFonts w:ascii="Calibri" w:hAnsi="Calibri" w:eastAsia="微软雅黑"/>
           <w:b w:val="0"/>
         </w:rPr>
-        <w:t>1.1 目标用户画像</w:t>
+        <w:t>1.1 现有 AI 客服优劣与差异化定位</w:t>
+      </w:r>
+    </w:p>
+    <w:p>
+      <w:pPr>
+        <w:spacing w:before="80" w:after="80"/>
+      </w:pPr>
+      <w:r>
+        <w:rPr>
+          <w:rFonts w:ascii="Calibri" w:hAnsi="Calibri" w:eastAsia="微软雅黑"/>
+          <w:i/>
+          <w:color w:val="667064"/>
+          <w:sz w:val="20"/>
+        </w:rPr>
+        <w:t>现有 AI 客服对比与本项目定位</w:t>
+      </w:r>
+    </w:p>
+    <w:tbl>
+      <w:tblPr>
+        <w:tblStyle w:val="TableGrid"/>
+        <w:tblW w:type="dxa" w:w="9360"/>
+        <w:tblLook w:firstColumn="1" w:firstRow="1" w:lastColumn="0" w:lastRow="0" w:noHBand="0" w:noVBand="1" w:val="04A0"/>
+        <w:tblInd w:w="120" w:type="dxa"/>
+      </w:tblPr>
+      <w:tblGrid>
+        <w:gridCol w:w="1800"/>
+        <w:gridCol w:w="3900"/>
+        <w:gridCol w:w="3660"/>
+      </w:tblGrid>
+      <w:tr>
+        <w:trPr>
+          <w:tblHeader w:val="true"/>
+        </w:trPr>
+        <w:tc>
+          <w:tcPr>
+            <w:tcW w:type="dxa" w:w="1800"/>
+            <w:tcMar>
+              <w:top w:w="80" w:type="dxa"/>
+              <w:bottom w:w="80" w:type="dxa"/>
+              <w:start w:w="120" w:type="dxa"/>
+              <w:end w:w="120" w:type="dxa"/>
+            </w:tcMar>
+            <w:vAlign w:val="center"/>
+            <w:shd w:fill="F2F4F7"/>
+          </w:tcPr>
+          <w:p>
+            <w:pPr>
+              <w:jc w:val="center"/>
+            </w:pPr>
+            <w:r>
+              <w:rPr>
+                <w:rFonts w:ascii="Calibri" w:hAnsi="Calibri" w:eastAsia="微软雅黑"/>
+                <w:b/>
+                <w:color w:val="20251F"/>
+                <w:sz w:val="21"/>
+              </w:rPr>
+              <w:t>对比维度</w:t>
+            </w:r>
+          </w:p>
+        </w:tc>
+        <w:tc>
+          <w:tcPr>
+            <w:tcW w:type="dxa" w:w="3900"/>
+            <w:tcMar>
+              <w:top w:w="80" w:type="dxa"/>
+              <w:bottom w:w="80" w:type="dxa"/>
+              <w:start w:w="120" w:type="dxa"/>
+              <w:end w:w="120" w:type="dxa"/>
+            </w:tcMar>
+            <w:vAlign w:val="center"/>
+            <w:shd w:fill="F2F4F7"/>
+          </w:tcPr>
+          <w:p>
+            <w:pPr>
+              <w:jc w:val="center"/>
+            </w:pPr>
+            <w:r>
+              <w:rPr>
+                <w:rFonts w:ascii="Calibri" w:hAnsi="Calibri" w:eastAsia="微软雅黑"/>
+                <w:b/>
+                <w:color w:val="20251F"/>
+                <w:sz w:val="21"/>
+              </w:rPr>
+              <w:t>现有 AI 客服常见表现</w:t>
+            </w:r>
+          </w:p>
+        </w:tc>
+        <w:tc>
+          <w:tcPr>
+            <w:tcW w:type="dxa" w:w="3660"/>
+            <w:tcMar>
+              <w:top w:w="80" w:type="dxa"/>
+              <w:bottom w:w="80" w:type="dxa"/>
+              <w:start w:w="120" w:type="dxa"/>
+              <w:end w:w="120" w:type="dxa"/>
+            </w:tcMar>
+            <w:vAlign w:val="center"/>
+            <w:shd w:fill="F2F4F7"/>
+          </w:tcPr>
+          <w:p>
+            <w:pPr>
+              <w:jc w:val="center"/>
+            </w:pPr>
+            <w:r>
+              <w:rPr>
+                <w:rFonts w:ascii="Calibri" w:hAnsi="Calibri" w:eastAsia="微软雅黑"/>
+                <w:b/>
+                <w:color w:val="20251F"/>
+                <w:sz w:val="21"/>
+              </w:rPr>
+              <w:t>本项目差异化设计</w:t>
+            </w:r>
+          </w:p>
+        </w:tc>
+      </w:tr>
+      <w:tr>
+        <w:tc>
+          <w:tcPr>
+            <w:tcW w:type="dxa" w:w="1800"/>
+            <w:tcMar>
+              <w:top w:w="80" w:type="dxa"/>
+              <w:bottom w:w="80" w:type="dxa"/>
+              <w:start w:w="120" w:type="dxa"/>
+              <w:end w:w="120" w:type="dxa"/>
+            </w:tcMar>
+            <w:vAlign w:val="center"/>
+          </w:tcPr>
+          <w:p>
+            <w:pPr>
+              <w:jc w:val="left"/>
+            </w:pPr>
+            <w:r>
+              <w:rPr>
+                <w:rFonts w:ascii="Calibri" w:hAnsi="Calibri" w:eastAsia="微软雅黑"/>
+                <w:color w:val="20251F"/>
+                <w:sz w:val="20"/>
+              </w:rPr>
+              <w:t>知识准确性</w:t>
+            </w:r>
+          </w:p>
+        </w:tc>
+        <w:tc>
+          <w:tcPr>
+            <w:tcW w:type="dxa" w:w="3900"/>
+            <w:tcMar>
+              <w:top w:w="80" w:type="dxa"/>
+              <w:bottom w:w="80" w:type="dxa"/>
+              <w:start w:w="120" w:type="dxa"/>
+              <w:end w:w="120" w:type="dxa"/>
+            </w:tcMar>
+            <w:vAlign w:val="center"/>
+          </w:tcPr>
+          <w:p>
+            <w:pPr>
+              <w:jc w:val="left"/>
+            </w:pPr>
+            <w:r>
+              <w:rPr>
+                <w:rFonts w:ascii="Calibri" w:hAnsi="Calibri" w:eastAsia="微软雅黑"/>
+                <w:color w:val="20251F"/>
+                <w:sz w:val="20"/>
+              </w:rPr>
+              <w:t>通用客服机器人容易给出泛化回答，售后政策和订单状态容易失真。</w:t>
+            </w:r>
+          </w:p>
+        </w:tc>
+        <w:tc>
+          <w:tcPr>
+            <w:tcW w:type="dxa" w:w="3660"/>
+            <w:tcMar>
+              <w:top w:w="80" w:type="dxa"/>
+              <w:bottom w:w="80" w:type="dxa"/>
+              <w:start w:w="120" w:type="dxa"/>
+              <w:end w:w="120" w:type="dxa"/>
+            </w:tcMar>
+            <w:vAlign w:val="center"/>
+          </w:tcPr>
+          <w:p>
+            <w:pPr>
+              <w:jc w:val="left"/>
+            </w:pPr>
+            <w:r>
+              <w:rPr>
+                <w:rFonts w:ascii="Calibri" w:hAnsi="Calibri" w:eastAsia="微软雅黑"/>
+                <w:color w:val="20251F"/>
+                <w:sz w:val="20"/>
+              </w:rPr>
+              <w:t>采用品牌知识库优先检索，订单状态只从 demo_orders 表查询，避免编造。</w:t>
+            </w:r>
+          </w:p>
+        </w:tc>
+      </w:tr>
+      <w:tr>
+        <w:tc>
+          <w:tcPr>
+            <w:tcW w:type="dxa" w:w="1800"/>
+            <w:tcMar>
+              <w:top w:w="80" w:type="dxa"/>
+              <w:bottom w:w="80" w:type="dxa"/>
+              <w:start w:w="120" w:type="dxa"/>
+              <w:end w:w="120" w:type="dxa"/>
+            </w:tcMar>
+            <w:vAlign w:val="center"/>
+          </w:tcPr>
+          <w:p>
+            <w:pPr>
+              <w:jc w:val="left"/>
+            </w:pPr>
+            <w:r>
+              <w:rPr>
+                <w:rFonts w:ascii="Calibri" w:hAnsi="Calibri" w:eastAsia="微软雅黑"/>
+                <w:color w:val="20251F"/>
+                <w:sz w:val="20"/>
+              </w:rPr>
+              <w:t>业务闭环</w:t>
+            </w:r>
+          </w:p>
+        </w:tc>
+        <w:tc>
+          <w:tcPr>
+            <w:tcW w:type="dxa" w:w="3900"/>
+            <w:tcMar>
+              <w:top w:w="80" w:type="dxa"/>
+              <w:bottom w:w="80" w:type="dxa"/>
+              <w:start w:w="120" w:type="dxa"/>
+              <w:end w:w="120" w:type="dxa"/>
+            </w:tcMar>
+            <w:vAlign w:val="center"/>
+          </w:tcPr>
+          <w:p>
+            <w:pPr>
+              <w:jc w:val="left"/>
+            </w:pPr>
+            <w:r>
+              <w:rPr>
+                <w:rFonts w:ascii="Calibri" w:hAnsi="Calibri" w:eastAsia="微软雅黑"/>
+                <w:color w:val="20251F"/>
+                <w:sz w:val="20"/>
+              </w:rPr>
+              <w:t>部分演示只停留在问答，缺少订单、工单和后台管理。</w:t>
+            </w:r>
+          </w:p>
+        </w:tc>
+        <w:tc>
+          <w:tcPr>
+            <w:tcW w:type="dxa" w:w="3660"/>
+            <w:tcMar>
+              <w:top w:w="80" w:type="dxa"/>
+              <w:bottom w:w="80" w:type="dxa"/>
+              <w:start w:w="120" w:type="dxa"/>
+              <w:end w:w="120" w:type="dxa"/>
+            </w:tcMar>
+            <w:vAlign w:val="center"/>
+          </w:tcPr>
+          <w:p>
+            <w:pPr>
+              <w:jc w:val="left"/>
+            </w:pPr>
+            <w:r>
+              <w:rPr>
+                <w:rFonts w:ascii="Calibri" w:hAnsi="Calibri" w:eastAsia="微软雅黑"/>
+                <w:color w:val="20251F"/>
+                <w:sz w:val="20"/>
+              </w:rPr>
+              <w:t>把买家聊天、订单查询、转人工工单、商家后台和 MySQL 数据表串成完整闭环。</w:t>
+            </w:r>
+          </w:p>
+        </w:tc>
+      </w:tr>
+      <w:tr>
+        <w:tc>
+          <w:tcPr>
+            <w:tcW w:type="dxa" w:w="1800"/>
+            <w:tcMar>
+              <w:top w:w="80" w:type="dxa"/>
+              <w:bottom w:w="80" w:type="dxa"/>
+              <w:start w:w="120" w:type="dxa"/>
+              <w:end w:w="120" w:type="dxa"/>
+            </w:tcMar>
+            <w:vAlign w:val="center"/>
+          </w:tcPr>
+          <w:p>
+            <w:pPr>
+              <w:jc w:val="left"/>
+            </w:pPr>
+            <w:r>
+              <w:rPr>
+                <w:rFonts w:ascii="Calibri" w:hAnsi="Calibri" w:eastAsia="微软雅黑"/>
+                <w:color w:val="20251F"/>
+                <w:sz w:val="20"/>
+              </w:rPr>
+              <w:t>演示稳定性</w:t>
+            </w:r>
+          </w:p>
+        </w:tc>
+        <w:tc>
+          <w:tcPr>
+            <w:tcW w:type="dxa" w:w="3900"/>
+            <w:tcMar>
+              <w:top w:w="80" w:type="dxa"/>
+              <w:bottom w:w="80" w:type="dxa"/>
+              <w:start w:w="120" w:type="dxa"/>
+              <w:end w:w="120" w:type="dxa"/>
+            </w:tcMar>
+            <w:vAlign w:val="center"/>
+          </w:tcPr>
+          <w:p>
+            <w:pPr>
+              <w:jc w:val="left"/>
+            </w:pPr>
+            <w:r>
+              <w:rPr>
+                <w:rFonts w:ascii="Calibri" w:hAnsi="Calibri" w:eastAsia="微软雅黑"/>
+                <w:color w:val="20251F"/>
+                <w:sz w:val="20"/>
+              </w:rPr>
+              <w:t>完全依赖外部大模型时，课堂网络或 Key 异常会影响展示。</w:t>
+            </w:r>
+          </w:p>
+        </w:tc>
+        <w:tc>
+          <w:tcPr>
+            <w:tcW w:type="dxa" w:w="3660"/>
+            <w:tcMar>
+              <w:top w:w="80" w:type="dxa"/>
+              <w:bottom w:w="80" w:type="dxa"/>
+              <w:start w:w="120" w:type="dxa"/>
+              <w:end w:w="120" w:type="dxa"/>
+            </w:tcMar>
+            <w:vAlign w:val="center"/>
+          </w:tcPr>
+          <w:p>
+            <w:pPr>
+              <w:jc w:val="left"/>
+            </w:pPr>
+            <w:r>
+              <w:rPr>
+                <w:rFonts w:ascii="Calibri" w:hAnsi="Calibri" w:eastAsia="微软雅黑"/>
+                <w:color w:val="20251F"/>
+                <w:sz w:val="20"/>
+              </w:rPr>
+              <w:t>DeepSeek 可选接入，同时保留本地检索兜底，保证无 Key 时也能完成核心演示。</w:t>
+            </w:r>
+          </w:p>
+        </w:tc>
+      </w:tr>
+      <w:tr>
+        <w:tc>
+          <w:tcPr>
+            <w:tcW w:type="dxa" w:w="1800"/>
+            <w:tcMar>
+              <w:top w:w="80" w:type="dxa"/>
+              <w:bottom w:w="80" w:type="dxa"/>
+              <w:start w:w="120" w:type="dxa"/>
+              <w:end w:w="120" w:type="dxa"/>
+            </w:tcMar>
+            <w:vAlign w:val="center"/>
+          </w:tcPr>
+          <w:p>
+            <w:pPr>
+              <w:jc w:val="left"/>
+            </w:pPr>
+            <w:r>
+              <w:rPr>
+                <w:rFonts w:ascii="Calibri" w:hAnsi="Calibri" w:eastAsia="微软雅黑"/>
+                <w:color w:val="20251F"/>
+                <w:sz w:val="20"/>
+              </w:rPr>
+              <w:t>可维护性</w:t>
+            </w:r>
+          </w:p>
+        </w:tc>
+        <w:tc>
+          <w:tcPr>
+            <w:tcW w:type="dxa" w:w="3900"/>
+            <w:tcMar>
+              <w:top w:w="80" w:type="dxa"/>
+              <w:bottom w:w="80" w:type="dxa"/>
+              <w:start w:w="120" w:type="dxa"/>
+              <w:end w:w="120" w:type="dxa"/>
+            </w:tcMar>
+            <w:vAlign w:val="center"/>
+          </w:tcPr>
+          <w:p>
+            <w:pPr>
+              <w:jc w:val="left"/>
+            </w:pPr>
+            <w:r>
+              <w:rPr>
+                <w:rFonts w:ascii="Calibri" w:hAnsi="Calibri" w:eastAsia="微软雅黑"/>
+                <w:color w:val="20251F"/>
+                <w:sz w:val="20"/>
+              </w:rPr>
+              <w:t>知识更新依赖开发人员改代码。</w:t>
+            </w:r>
+          </w:p>
+        </w:tc>
+        <w:tc>
+          <w:tcPr>
+            <w:tcW w:type="dxa" w:w="3660"/>
+            <w:tcMar>
+              <w:top w:w="80" w:type="dxa"/>
+              <w:bottom w:w="80" w:type="dxa"/>
+              <w:start w:w="120" w:type="dxa"/>
+              <w:end w:w="120" w:type="dxa"/>
+            </w:tcMar>
+            <w:vAlign w:val="center"/>
+          </w:tcPr>
+          <w:p>
+            <w:pPr>
+              <w:jc w:val="left"/>
+            </w:pPr>
+            <w:r>
+              <w:rPr>
+                <w:rFonts w:ascii="Calibri" w:hAnsi="Calibri" w:eastAsia="微软雅黑"/>
+                <w:color w:val="20251F"/>
+                <w:sz w:val="20"/>
+              </w:rPr>
+              <w:t>商家后台提供知识库 CRUD，运营人员可直接维护标准问答。</w:t>
+            </w:r>
+          </w:p>
+        </w:tc>
+      </w:tr>
+      <w:tr>
+        <w:tc>
+          <w:tcPr>
+            <w:tcW w:type="dxa" w:w="1800"/>
+            <w:tcMar>
+              <w:top w:w="80" w:type="dxa"/>
+              <w:bottom w:w="80" w:type="dxa"/>
+              <w:start w:w="120" w:type="dxa"/>
+              <w:end w:w="120" w:type="dxa"/>
+            </w:tcMar>
+            <w:vAlign w:val="center"/>
+          </w:tcPr>
+          <w:p>
+            <w:pPr>
+              <w:jc w:val="left"/>
+            </w:pPr>
+            <w:r>
+              <w:rPr>
+                <w:rFonts w:ascii="Calibri" w:hAnsi="Calibri" w:eastAsia="微软雅黑"/>
+                <w:color w:val="20251F"/>
+                <w:sz w:val="20"/>
+              </w:rPr>
+              <w:t>边界意识</w:t>
+            </w:r>
+          </w:p>
+        </w:tc>
+        <w:tc>
+          <w:tcPr>
+            <w:tcW w:type="dxa" w:w="3900"/>
+            <w:tcMar>
+              <w:top w:w="80" w:type="dxa"/>
+              <w:bottom w:w="80" w:type="dxa"/>
+              <w:start w:w="120" w:type="dxa"/>
+              <w:end w:w="120" w:type="dxa"/>
+            </w:tcMar>
+            <w:vAlign w:val="center"/>
+          </w:tcPr>
+          <w:p>
+            <w:pPr>
+              <w:jc w:val="left"/>
+            </w:pPr>
+            <w:r>
+              <w:rPr>
+                <w:rFonts w:ascii="Calibri" w:hAnsi="Calibri" w:eastAsia="微软雅黑"/>
+                <w:color w:val="20251F"/>
+                <w:sz w:val="20"/>
+              </w:rPr>
+              <w:t>可能承诺退款、检测结论或库存信息。</w:t>
+            </w:r>
+          </w:p>
+        </w:tc>
+        <w:tc>
+          <w:tcPr>
+            <w:tcW w:type="dxa" w:w="3660"/>
+            <w:tcMar>
+              <w:top w:w="80" w:type="dxa"/>
+              <w:bottom w:w="80" w:type="dxa"/>
+              <w:start w:w="120" w:type="dxa"/>
+              <w:end w:w="120" w:type="dxa"/>
+            </w:tcMar>
+            <w:vAlign w:val="center"/>
+          </w:tcPr>
+          <w:p>
+            <w:pPr>
+              <w:jc w:val="left"/>
+            </w:pPr>
+            <w:r>
+              <w:rPr>
+                <w:rFonts w:ascii="Calibri" w:hAnsi="Calibri" w:eastAsia="微软雅黑"/>
+                <w:color w:val="20251F"/>
+                <w:sz w:val="20"/>
+              </w:rPr>
+              <w:t>提示词明确禁止编造订单、价格、库存和检测结论，复杂争议转人工。</w:t>
+            </w:r>
+          </w:p>
+        </w:tc>
+      </w:tr>
+    </w:tbl>
+    <w:p/>
+    <w:p>
+      <w:pPr>
+        <w:pStyle w:val="Heading2"/>
+      </w:pPr>
+      <w:r>
+        <w:rPr>
+          <w:rFonts w:ascii="Calibri" w:hAnsi="Calibri" w:eastAsia="微软雅黑"/>
+          <w:b w:val="0"/>
+        </w:rPr>
+        <w:t>1.2 目标用户画像</w:t>
       </w:r>
     </w:p>
     <w:p>
@@ -1293,7 +1804,7 @@
           <w:rFonts w:ascii="Calibri" w:hAnsi="Calibri" w:eastAsia="微软雅黑"/>
           <w:b w:val="0"/>
         </w:rPr>
-        <w:t>1.2 核心功能定位</w:t>
+        <w:t>1.3 核心功能定位</w:t>
       </w:r>
     </w:p>
     <w:p>
@@ -5761,7 +6272,7 @@
           <w:rFonts w:ascii="Calibri" w:hAnsi="Calibri" w:eastAsia="微软雅黑"/>
           <w:b w:val="0"/>
         </w:rPr>
-        <w:t>本地测试采用 API 烟测、浏览器交互测试和移动端视口检查。由于生产部署需要云服务器、域名或平台账号，本报告将生产 URL 标记为待部署后填写；项目代码已提供部署步骤和环境变量说明。</w:t>
+        <w:t>项目已完成本地测试、MySQL 课堂演示测试和腾讯云公有云部署验收。测试范围覆盖 API 健康检查、聊天问答、订单查询、转人工工单、商家后台、知识库加载、桌面端与移动端界面。生产环境已经通过 Nginx 对外发布，公开访问地址为 http://1.14.184.75。</w:t>
       </w:r>
     </w:p>
     <w:p>
@@ -6902,69 +7413,503 @@
     </w:p>
     <w:p>
       <w:pPr>
-        <w:pStyle w:val="ListNumber"/>
+        <w:spacing w:before="80" w:after="80"/>
       </w:pPr>
       <w:r>
         <w:rPr>
           <w:rFonts w:ascii="Calibri" w:hAnsi="Calibri" w:eastAsia="微软雅黑"/>
-          <w:color w:val="20251F"/>
-          <w:sz w:val="22"/>
+          <w:i/>
+          <w:color w:val="667064"/>
+          <w:sz w:val="20"/>
         </w:rPr>
-        <w:t>准备云服务器或平台环境，安装 Python 3.10+。</w:t>
+        <w:t>公有云部署环境与验收结果</w:t>
       </w:r>
     </w:p>
-    <w:p>
-      <w:pPr>
-        <w:pStyle w:val="ListNumber"/>
-      </w:pPr>
-      <w:r>
-        <w:rPr>
-          <w:rFonts w:ascii="Calibri" w:hAnsi="Calibri" w:eastAsia="微软雅黑"/>
-          <w:color w:val="20251F"/>
-          <w:sz w:val="22"/>
-        </w:rPr>
-        <w:t>上传项目代码，设置 DEEPSEEK_API_KEY、CHATBOT_HOST、CHATBOT_PORT、CHATBOT_DB 等环境变量。</w:t>
-      </w:r>
-    </w:p>
-    <w:p>
-      <w:pPr>
-        <w:pStyle w:val="ListNumber"/>
-      </w:pPr>
-      <w:r>
-        <w:rPr>
-          <w:rFonts w:ascii="Calibri" w:hAnsi="Calibri" w:eastAsia="微软雅黑"/>
-          <w:color w:val="20251F"/>
-          <w:sz w:val="22"/>
-        </w:rPr>
-        <w:t>后端运行 backend/server.py，前端可用 Nginx、静态托管或 python -m http.server 发布。</w:t>
-      </w:r>
-    </w:p>
-    <w:p>
-      <w:pPr>
-        <w:pStyle w:val="ListNumber"/>
-      </w:pPr>
-      <w:r>
-        <w:rPr>
-          <w:rFonts w:ascii="Calibri" w:hAnsi="Calibri" w:eastAsia="微软雅黑"/>
-          <w:color w:val="20251F"/>
-          <w:sz w:val="22"/>
-        </w:rPr>
-        <w:t>把前端 API 地址改为后端公网地址，并在页面设置中保存。</w:t>
-      </w:r>
-    </w:p>
-    <w:p>
-      <w:pPr>
-        <w:pStyle w:val="ListNumber"/>
-      </w:pPr>
-      <w:r>
-        <w:rPr>
-          <w:rFonts w:ascii="Calibri" w:hAnsi="Calibri" w:eastAsia="微软雅黑"/>
-          <w:color w:val="20251F"/>
-          <w:sz w:val="22"/>
-        </w:rPr>
-        <w:t>完成联调后，将生产环境 URL 和代码仓库地址补入本报告首页。</w:t>
-      </w:r>
-    </w:p>
+    <w:tbl>
+      <w:tblPr>
+        <w:tblStyle w:val="TableGrid"/>
+        <w:tblW w:type="dxa" w:w="9360"/>
+        <w:tblLook w:firstColumn="1" w:firstRow="1" w:lastColumn="0" w:lastRow="0" w:noHBand="0" w:noVBand="1" w:val="04A0"/>
+        <w:tblInd w:w="120" w:type="dxa"/>
+      </w:tblPr>
+      <w:tblGrid>
+        <w:gridCol w:w="1700"/>
+        <w:gridCol w:w="5100"/>
+        <w:gridCol w:w="2560"/>
+      </w:tblGrid>
+      <w:tr>
+        <w:trPr>
+          <w:tblHeader w:val="true"/>
+        </w:trPr>
+        <w:tc>
+          <w:tcPr>
+            <w:tcW w:type="dxa" w:w="1700"/>
+            <w:tcMar>
+              <w:top w:w="80" w:type="dxa"/>
+              <w:bottom w:w="80" w:type="dxa"/>
+              <w:start w:w="120" w:type="dxa"/>
+              <w:end w:w="120" w:type="dxa"/>
+            </w:tcMar>
+            <w:vAlign w:val="center"/>
+            <w:shd w:fill="F2F4F7"/>
+          </w:tcPr>
+          <w:p>
+            <w:pPr>
+              <w:jc w:val="center"/>
+            </w:pPr>
+            <w:r>
+              <w:rPr>
+                <w:rFonts w:ascii="Calibri" w:hAnsi="Calibri" w:eastAsia="微软雅黑"/>
+                <w:b/>
+                <w:color w:val="20251F"/>
+                <w:sz w:val="21"/>
+              </w:rPr>
+              <w:t>部署项</w:t>
+            </w:r>
+          </w:p>
+        </w:tc>
+        <w:tc>
+          <w:tcPr>
+            <w:tcW w:type="dxa" w:w="5100"/>
+            <w:tcMar>
+              <w:top w:w="80" w:type="dxa"/>
+              <w:bottom w:w="80" w:type="dxa"/>
+              <w:start w:w="120" w:type="dxa"/>
+              <w:end w:w="120" w:type="dxa"/>
+            </w:tcMar>
+            <w:vAlign w:val="center"/>
+            <w:shd w:fill="F2F4F7"/>
+          </w:tcPr>
+          <w:p>
+            <w:pPr>
+              <w:jc w:val="center"/>
+            </w:pPr>
+            <w:r>
+              <w:rPr>
+                <w:rFonts w:ascii="Calibri" w:hAnsi="Calibri" w:eastAsia="微软雅黑"/>
+                <w:b/>
+                <w:color w:val="20251F"/>
+                <w:sz w:val="21"/>
+              </w:rPr>
+              <w:t>当前配置</w:t>
+            </w:r>
+          </w:p>
+        </w:tc>
+        <w:tc>
+          <w:tcPr>
+            <w:tcW w:type="dxa" w:w="2560"/>
+            <w:tcMar>
+              <w:top w:w="80" w:type="dxa"/>
+              <w:bottom w:w="80" w:type="dxa"/>
+              <w:start w:w="120" w:type="dxa"/>
+              <w:end w:w="120" w:type="dxa"/>
+            </w:tcMar>
+            <w:vAlign w:val="center"/>
+            <w:shd w:fill="F2F4F7"/>
+          </w:tcPr>
+          <w:p>
+            <w:pPr>
+              <w:jc w:val="center"/>
+            </w:pPr>
+            <w:r>
+              <w:rPr>
+                <w:rFonts w:ascii="Calibri" w:hAnsi="Calibri" w:eastAsia="微软雅黑"/>
+                <w:b/>
+                <w:color w:val="20251F"/>
+                <w:sz w:val="21"/>
+              </w:rPr>
+              <w:t>验收结果</w:t>
+            </w:r>
+          </w:p>
+        </w:tc>
+      </w:tr>
+      <w:tr>
+        <w:tc>
+          <w:tcPr>
+            <w:tcW w:type="dxa" w:w="1700"/>
+            <w:tcMar>
+              <w:top w:w="80" w:type="dxa"/>
+              <w:bottom w:w="80" w:type="dxa"/>
+              <w:start w:w="120" w:type="dxa"/>
+              <w:end w:w="120" w:type="dxa"/>
+            </w:tcMar>
+            <w:vAlign w:val="center"/>
+          </w:tcPr>
+          <w:p>
+            <w:pPr>
+              <w:jc w:val="left"/>
+            </w:pPr>
+            <w:r>
+              <w:rPr>
+                <w:rFonts w:ascii="Calibri" w:hAnsi="Calibri" w:eastAsia="微软雅黑"/>
+                <w:color w:val="20251F"/>
+                <w:sz w:val="20"/>
+              </w:rPr>
+              <w:t>云服务器</w:t>
+            </w:r>
+          </w:p>
+        </w:tc>
+        <w:tc>
+          <w:tcPr>
+            <w:tcW w:type="dxa" w:w="5100"/>
+            <w:tcMar>
+              <w:top w:w="80" w:type="dxa"/>
+              <w:bottom w:w="80" w:type="dxa"/>
+              <w:start w:w="120" w:type="dxa"/>
+              <w:end w:w="120" w:type="dxa"/>
+            </w:tcMar>
+            <w:vAlign w:val="center"/>
+          </w:tcPr>
+          <w:p>
+            <w:pPr>
+              <w:jc w:val="left"/>
+            </w:pPr>
+            <w:r>
+              <w:rPr>
+                <w:rFonts w:ascii="Calibri" w:hAnsi="Calibri" w:eastAsia="微软雅黑"/>
+                <w:color w:val="20251F"/>
+                <w:sz w:val="20"/>
+              </w:rPr>
+              <w:t>腾讯云轻量应用服务器，Ubuntu 22.04，2 核 CPU / 2GB 内存 / 40GB 系统盘。</w:t>
+            </w:r>
+          </w:p>
+        </w:tc>
+        <w:tc>
+          <w:tcPr>
+            <w:tcW w:type="dxa" w:w="2560"/>
+            <w:tcMar>
+              <w:top w:w="80" w:type="dxa"/>
+              <w:bottom w:w="80" w:type="dxa"/>
+              <w:start w:w="120" w:type="dxa"/>
+              <w:end w:w="120" w:type="dxa"/>
+            </w:tcMar>
+            <w:vAlign w:val="center"/>
+          </w:tcPr>
+          <w:p>
+            <w:pPr>
+              <w:jc w:val="left"/>
+            </w:pPr>
+            <w:r>
+              <w:rPr>
+                <w:rFonts w:ascii="Calibri" w:hAnsi="Calibri" w:eastAsia="微软雅黑"/>
+                <w:color w:val="20251F"/>
+                <w:sz w:val="20"/>
+              </w:rPr>
+              <w:t>运行正常。</w:t>
+            </w:r>
+          </w:p>
+        </w:tc>
+      </w:tr>
+      <w:tr>
+        <w:tc>
+          <w:tcPr>
+            <w:tcW w:type="dxa" w:w="1700"/>
+            <w:tcMar>
+              <w:top w:w="80" w:type="dxa"/>
+              <w:bottom w:w="80" w:type="dxa"/>
+              <w:start w:w="120" w:type="dxa"/>
+              <w:end w:w="120" w:type="dxa"/>
+            </w:tcMar>
+            <w:vAlign w:val="center"/>
+          </w:tcPr>
+          <w:p>
+            <w:pPr>
+              <w:jc w:val="left"/>
+            </w:pPr>
+            <w:r>
+              <w:rPr>
+                <w:rFonts w:ascii="Calibri" w:hAnsi="Calibri" w:eastAsia="微软雅黑"/>
+                <w:color w:val="20251F"/>
+                <w:sz w:val="20"/>
+              </w:rPr>
+              <w:t>后端服务</w:t>
+            </w:r>
+          </w:p>
+        </w:tc>
+        <w:tc>
+          <w:tcPr>
+            <w:tcW w:type="dxa" w:w="5100"/>
+            <w:tcMar>
+              <w:top w:w="80" w:type="dxa"/>
+              <w:bottom w:w="80" w:type="dxa"/>
+              <w:start w:w="120" w:type="dxa"/>
+              <w:end w:w="120" w:type="dxa"/>
+            </w:tcMar>
+            <w:vAlign w:val="center"/>
+          </w:tcPr>
+          <w:p>
+            <w:pPr>
+              <w:jc w:val="left"/>
+            </w:pPr>
+            <w:r>
+              <w:rPr>
+                <w:rFonts w:ascii="Calibri" w:hAnsi="Calibri" w:eastAsia="微软雅黑"/>
+                <w:color w:val="20251F"/>
+                <w:sz w:val="20"/>
+              </w:rPr>
+              <w:t>systemd 管理 salescare-ai.service，监听 127.0.0.1:8000。</w:t>
+            </w:r>
+          </w:p>
+        </w:tc>
+        <w:tc>
+          <w:tcPr>
+            <w:tcW w:type="dxa" w:w="2560"/>
+            <w:tcMar>
+              <w:top w:w="80" w:type="dxa"/>
+              <w:bottom w:w="80" w:type="dxa"/>
+              <w:start w:w="120" w:type="dxa"/>
+              <w:end w:w="120" w:type="dxa"/>
+            </w:tcMar>
+            <w:vAlign w:val="center"/>
+          </w:tcPr>
+          <w:p>
+            <w:pPr>
+              <w:jc w:val="left"/>
+            </w:pPr>
+            <w:r>
+              <w:rPr>
+                <w:rFonts w:ascii="Calibri" w:hAnsi="Calibri" w:eastAsia="微软雅黑"/>
+                <w:color w:val="20251F"/>
+                <w:sz w:val="20"/>
+              </w:rPr>
+              <w:t>健康检查返回 ok。</w:t>
+            </w:r>
+          </w:p>
+        </w:tc>
+      </w:tr>
+      <w:tr>
+        <w:tc>
+          <w:tcPr>
+            <w:tcW w:type="dxa" w:w="1700"/>
+            <w:tcMar>
+              <w:top w:w="80" w:type="dxa"/>
+              <w:bottom w:w="80" w:type="dxa"/>
+              <w:start w:w="120" w:type="dxa"/>
+              <w:end w:w="120" w:type="dxa"/>
+            </w:tcMar>
+            <w:vAlign w:val="center"/>
+          </w:tcPr>
+          <w:p>
+            <w:pPr>
+              <w:jc w:val="left"/>
+            </w:pPr>
+            <w:r>
+              <w:rPr>
+                <w:rFonts w:ascii="Calibri" w:hAnsi="Calibri" w:eastAsia="微软雅黑"/>
+                <w:color w:val="20251F"/>
+                <w:sz w:val="20"/>
+              </w:rPr>
+              <w:t>数据库</w:t>
+            </w:r>
+          </w:p>
+        </w:tc>
+        <w:tc>
+          <w:tcPr>
+            <w:tcW w:type="dxa" w:w="5100"/>
+            <w:tcMar>
+              <w:top w:w="80" w:type="dxa"/>
+              <w:bottom w:w="80" w:type="dxa"/>
+              <w:start w:w="120" w:type="dxa"/>
+              <w:end w:w="120" w:type="dxa"/>
+            </w:tcMar>
+            <w:vAlign w:val="center"/>
+          </w:tcPr>
+          <w:p>
+            <w:pPr>
+              <w:jc w:val="left"/>
+            </w:pPr>
+            <w:r>
+              <w:rPr>
+                <w:rFonts w:ascii="Calibri" w:hAnsi="Calibri" w:eastAsia="微软雅黑"/>
+                <w:color w:val="20251F"/>
+                <w:sz w:val="20"/>
+              </w:rPr>
+              <w:t>MySQL 8.0，salescare_ai 数据库，包含 5 张核心表和 12 条知识库数据。</w:t>
+            </w:r>
+          </w:p>
+        </w:tc>
+        <w:tc>
+          <w:tcPr>
+            <w:tcW w:type="dxa" w:w="2560"/>
+            <w:tcMar>
+              <w:top w:w="80" w:type="dxa"/>
+              <w:bottom w:w="80" w:type="dxa"/>
+              <w:start w:w="120" w:type="dxa"/>
+              <w:end w:w="120" w:type="dxa"/>
+            </w:tcMar>
+            <w:vAlign w:val="center"/>
+          </w:tcPr>
+          <w:p>
+            <w:pPr>
+              <w:jc w:val="left"/>
+            </w:pPr>
+            <w:r>
+              <w:rPr>
+                <w:rFonts w:ascii="Calibri" w:hAnsi="Calibri" w:eastAsia="微软雅黑"/>
+                <w:color w:val="20251F"/>
+                <w:sz w:val="20"/>
+              </w:rPr>
+              <w:t>SHOW TABLES 与 COUNT 验证通过。</w:t>
+            </w:r>
+          </w:p>
+        </w:tc>
+      </w:tr>
+      <w:tr>
+        <w:tc>
+          <w:tcPr>
+            <w:tcW w:type="dxa" w:w="1700"/>
+            <w:tcMar>
+              <w:top w:w="80" w:type="dxa"/>
+              <w:bottom w:w="80" w:type="dxa"/>
+              <w:start w:w="120" w:type="dxa"/>
+              <w:end w:w="120" w:type="dxa"/>
+            </w:tcMar>
+            <w:vAlign w:val="center"/>
+          </w:tcPr>
+          <w:p>
+            <w:pPr>
+              <w:jc w:val="left"/>
+            </w:pPr>
+            <w:r>
+              <w:rPr>
+                <w:rFonts w:ascii="Calibri" w:hAnsi="Calibri" w:eastAsia="微软雅黑"/>
+                <w:color w:val="20251F"/>
+                <w:sz w:val="20"/>
+              </w:rPr>
+              <w:t>前端发布</w:t>
+            </w:r>
+          </w:p>
+        </w:tc>
+        <w:tc>
+          <w:tcPr>
+            <w:tcW w:type="dxa" w:w="5100"/>
+            <w:tcMar>
+              <w:top w:w="80" w:type="dxa"/>
+              <w:bottom w:w="80" w:type="dxa"/>
+              <w:start w:w="120" w:type="dxa"/>
+              <w:end w:w="120" w:type="dxa"/>
+            </w:tcMar>
+            <w:vAlign w:val="center"/>
+          </w:tcPr>
+          <w:p>
+            <w:pPr>
+              <w:jc w:val="left"/>
+            </w:pPr>
+            <w:r>
+              <w:rPr>
+                <w:rFonts w:ascii="Calibri" w:hAnsi="Calibri" w:eastAsia="微软雅黑"/>
+                <w:color w:val="20251F"/>
+                <w:sz w:val="20"/>
+              </w:rPr>
+              <w:t>Nginx 托管 /opt/salescare-ai/frontend，并将 /api/ 反向代理到后端。</w:t>
+            </w:r>
+          </w:p>
+        </w:tc>
+        <w:tc>
+          <w:tcPr>
+            <w:tcW w:type="dxa" w:w="2560"/>
+            <w:tcMar>
+              <w:top w:w="80" w:type="dxa"/>
+              <w:bottom w:w="80" w:type="dxa"/>
+              <w:start w:w="120" w:type="dxa"/>
+              <w:end w:w="120" w:type="dxa"/>
+            </w:tcMar>
+            <w:vAlign w:val="center"/>
+          </w:tcPr>
+          <w:p>
+            <w:pPr>
+              <w:jc w:val="left"/>
+            </w:pPr>
+            <w:r>
+              <w:rPr>
+                <w:rFonts w:ascii="Calibri" w:hAnsi="Calibri" w:eastAsia="微软雅黑"/>
+                <w:color w:val="20251F"/>
+                <w:sz w:val="20"/>
+              </w:rPr>
+              <w:t>公网页面可访问。</w:t>
+            </w:r>
+          </w:p>
+        </w:tc>
+      </w:tr>
+      <w:tr>
+        <w:tc>
+          <w:tcPr>
+            <w:tcW w:type="dxa" w:w="1700"/>
+            <w:tcMar>
+              <w:top w:w="80" w:type="dxa"/>
+              <w:bottom w:w="80" w:type="dxa"/>
+              <w:start w:w="120" w:type="dxa"/>
+              <w:end w:w="120" w:type="dxa"/>
+            </w:tcMar>
+            <w:vAlign w:val="center"/>
+          </w:tcPr>
+          <w:p>
+            <w:pPr>
+              <w:jc w:val="left"/>
+            </w:pPr>
+            <w:r>
+              <w:rPr>
+                <w:rFonts w:ascii="Calibri" w:hAnsi="Calibri" w:eastAsia="微软雅黑"/>
+                <w:color w:val="20251F"/>
+                <w:sz w:val="20"/>
+              </w:rPr>
+              <w:t>访问方式</w:t>
+            </w:r>
+          </w:p>
+        </w:tc>
+        <w:tc>
+          <w:tcPr>
+            <w:tcW w:type="dxa" w:w="5100"/>
+            <w:tcMar>
+              <w:top w:w="80" w:type="dxa"/>
+              <w:bottom w:w="80" w:type="dxa"/>
+              <w:start w:w="120" w:type="dxa"/>
+              <w:end w:w="120" w:type="dxa"/>
+            </w:tcMar>
+            <w:vAlign w:val="center"/>
+          </w:tcPr>
+          <w:p>
+            <w:pPr>
+              <w:jc w:val="left"/>
+            </w:pPr>
+            <w:r>
+              <w:rPr>
+                <w:rFonts w:ascii="Calibri" w:hAnsi="Calibri" w:eastAsia="微软雅黑"/>
+                <w:color w:val="20251F"/>
+                <w:sz w:val="20"/>
+              </w:rPr>
+              <w:t>Web 应用生产环境 URL：http://1.14.184.75；代码仓库：https://github.com/317flystudent/salescare-ai。</w:t>
+            </w:r>
+          </w:p>
+        </w:tc>
+        <w:tc>
+          <w:tcPr>
+            <w:tcW w:type="dxa" w:w="2560"/>
+            <w:tcMar>
+              <w:top w:w="80" w:type="dxa"/>
+              <w:bottom w:w="80" w:type="dxa"/>
+              <w:start w:w="120" w:type="dxa"/>
+              <w:end w:w="120" w:type="dxa"/>
+            </w:tcMar>
+            <w:vAlign w:val="center"/>
+          </w:tcPr>
+          <w:p>
+            <w:pPr>
+              <w:jc w:val="left"/>
+            </w:pPr>
+            <w:r>
+              <w:rPr>
+                <w:rFonts w:ascii="Calibri" w:hAnsi="Calibri" w:eastAsia="微软雅黑"/>
+                <w:color w:val="20251F"/>
+                <w:sz w:val="20"/>
+              </w:rPr>
+              <w:t>已写入报告首页和 README。</w:t>
+            </w:r>
+          </w:p>
+        </w:tc>
+      </w:tr>
+    </w:tbl>
+    <w:p/>
     <w:p>
       <w:pPr>
         <w:pStyle w:val="Heading1"/>
@@ -7624,6 +8569,517 @@
                 <w:sz w:val="20"/>
               </w:rPr>
               <w:t>形成项目报告，准备演示脚本和答辩说明。</w:t>
+            </w:r>
+          </w:p>
+        </w:tc>
+      </w:tr>
+    </w:tbl>
+    <w:p/>
+    <w:p>
+      <w:pPr>
+        <w:pStyle w:val="Heading2"/>
+      </w:pPr>
+      <w:r>
+        <w:rPr>
+          <w:rFonts w:ascii="Calibri" w:hAnsi="Calibri" w:eastAsia="微软雅黑"/>
+          <w:b w:val="0"/>
+        </w:rPr>
+        <w:t>6.1 更新日志与提交记录</w:t>
+      </w:r>
+    </w:p>
+    <w:p>
+      <w:pPr>
+        <w:spacing w:before="80" w:after="80"/>
+      </w:pPr>
+      <w:r>
+        <w:rPr>
+          <w:rFonts w:ascii="Calibri" w:hAnsi="Calibri" w:eastAsia="微软雅黑"/>
+          <w:i/>
+          <w:color w:val="667064"/>
+          <w:sz w:val="20"/>
+        </w:rPr>
+        <w:t>项目管理与更新日志</w:t>
+      </w:r>
+    </w:p>
+    <w:tbl>
+      <w:tblPr>
+        <w:tblStyle w:val="TableGrid"/>
+        <w:tblW w:type="dxa" w:w="9360"/>
+        <w:tblLook w:firstColumn="1" w:firstRow="1" w:lastColumn="0" w:lastRow="0" w:noHBand="0" w:noVBand="1" w:val="04A0"/>
+        <w:tblInd w:w="120" w:type="dxa"/>
+      </w:tblPr>
+      <w:tblGrid>
+        <w:gridCol w:w="1800"/>
+        <w:gridCol w:w="5200"/>
+        <w:gridCol w:w="2360"/>
+      </w:tblGrid>
+      <w:tr>
+        <w:trPr>
+          <w:tblHeader w:val="true"/>
+        </w:trPr>
+        <w:tc>
+          <w:tcPr>
+            <w:tcW w:type="dxa" w:w="1800"/>
+            <w:tcMar>
+              <w:top w:w="80" w:type="dxa"/>
+              <w:bottom w:w="80" w:type="dxa"/>
+              <w:start w:w="120" w:type="dxa"/>
+              <w:end w:w="120" w:type="dxa"/>
+            </w:tcMar>
+            <w:vAlign w:val="center"/>
+            <w:shd w:fill="F2F4F7"/>
+          </w:tcPr>
+          <w:p>
+            <w:pPr>
+              <w:jc w:val="center"/>
+            </w:pPr>
+            <w:r>
+              <w:rPr>
+                <w:rFonts w:ascii="Calibri" w:hAnsi="Calibri" w:eastAsia="微软雅黑"/>
+                <w:b/>
+                <w:color w:val="20251F"/>
+                <w:sz w:val="21"/>
+              </w:rPr>
+              <w:t>记录类型</w:t>
+            </w:r>
+          </w:p>
+        </w:tc>
+        <w:tc>
+          <w:tcPr>
+            <w:tcW w:type="dxa" w:w="5200"/>
+            <w:tcMar>
+              <w:top w:w="80" w:type="dxa"/>
+              <w:bottom w:w="80" w:type="dxa"/>
+              <w:start w:w="120" w:type="dxa"/>
+              <w:end w:w="120" w:type="dxa"/>
+            </w:tcMar>
+            <w:vAlign w:val="center"/>
+            <w:shd w:fill="F2F4F7"/>
+          </w:tcPr>
+          <w:p>
+            <w:pPr>
+              <w:jc w:val="center"/>
+            </w:pPr>
+            <w:r>
+              <w:rPr>
+                <w:rFonts w:ascii="Calibri" w:hAnsi="Calibri" w:eastAsia="微软雅黑"/>
+                <w:b/>
+                <w:color w:val="20251F"/>
+                <w:sz w:val="21"/>
+              </w:rPr>
+              <w:t>内容</w:t>
+            </w:r>
+          </w:p>
+        </w:tc>
+        <w:tc>
+          <w:tcPr>
+            <w:tcW w:type="dxa" w:w="2360"/>
+            <w:tcMar>
+              <w:top w:w="80" w:type="dxa"/>
+              <w:bottom w:w="80" w:type="dxa"/>
+              <w:start w:w="120" w:type="dxa"/>
+              <w:end w:w="120" w:type="dxa"/>
+            </w:tcMar>
+            <w:vAlign w:val="center"/>
+            <w:shd w:fill="F2F4F7"/>
+          </w:tcPr>
+          <w:p>
+            <w:pPr>
+              <w:jc w:val="center"/>
+            </w:pPr>
+            <w:r>
+              <w:rPr>
+                <w:rFonts w:ascii="Calibri" w:hAnsi="Calibri" w:eastAsia="微软雅黑"/>
+                <w:b/>
+                <w:color w:val="20251F"/>
+                <w:sz w:val="21"/>
+              </w:rPr>
+              <w:t>对应证据</w:t>
+            </w:r>
+          </w:p>
+        </w:tc>
+      </w:tr>
+      <w:tr>
+        <w:tc>
+          <w:tcPr>
+            <w:tcW w:type="dxa" w:w="1800"/>
+            <w:tcMar>
+              <w:top w:w="80" w:type="dxa"/>
+              <w:bottom w:w="80" w:type="dxa"/>
+              <w:start w:w="120" w:type="dxa"/>
+              <w:end w:w="120" w:type="dxa"/>
+            </w:tcMar>
+            <w:vAlign w:val="center"/>
+          </w:tcPr>
+          <w:p>
+            <w:pPr>
+              <w:jc w:val="left"/>
+            </w:pPr>
+            <w:r>
+              <w:rPr>
+                <w:rFonts w:ascii="Calibri" w:hAnsi="Calibri" w:eastAsia="微软雅黑"/>
+                <w:color w:val="20251F"/>
+                <w:sz w:val="20"/>
+              </w:rPr>
+              <w:t>初始提交</w:t>
+            </w:r>
+          </w:p>
+        </w:tc>
+        <w:tc>
+          <w:tcPr>
+            <w:tcW w:type="dxa" w:w="5200"/>
+            <w:tcMar>
+              <w:top w:w="80" w:type="dxa"/>
+              <w:bottom w:w="80" w:type="dxa"/>
+              <w:start w:w="120" w:type="dxa"/>
+              <w:end w:w="120" w:type="dxa"/>
+            </w:tcMar>
+            <w:vAlign w:val="center"/>
+          </w:tcPr>
+          <w:p>
+            <w:pPr>
+              <w:jc w:val="left"/>
+            </w:pPr>
+            <w:r>
+              <w:rPr>
+                <w:rFonts w:ascii="Calibri" w:hAnsi="Calibri" w:eastAsia="微软雅黑"/>
+                <w:color w:val="20251F"/>
+                <w:sz w:val="20"/>
+              </w:rPr>
+              <w:t>Initial course project submission：提交前后端源码、数据库脚本、README、课堂演示文档和初版报告。</w:t>
+            </w:r>
+          </w:p>
+        </w:tc>
+        <w:tc>
+          <w:tcPr>
+            <w:tcW w:type="dxa" w:w="2360"/>
+            <w:tcMar>
+              <w:top w:w="80" w:type="dxa"/>
+              <w:bottom w:w="80" w:type="dxa"/>
+              <w:start w:w="120" w:type="dxa"/>
+              <w:end w:w="120" w:type="dxa"/>
+            </w:tcMar>
+            <w:vAlign w:val="center"/>
+          </w:tcPr>
+          <w:p>
+            <w:pPr>
+              <w:jc w:val="left"/>
+            </w:pPr>
+            <w:r>
+              <w:rPr>
+                <w:rFonts w:ascii="Calibri" w:hAnsi="Calibri" w:eastAsia="微软雅黑"/>
+                <w:color w:val="20251F"/>
+                <w:sz w:val="20"/>
+              </w:rPr>
+              <w:t>Git 提交 636e005。</w:t>
+            </w:r>
+          </w:p>
+        </w:tc>
+      </w:tr>
+      <w:tr>
+        <w:tc>
+          <w:tcPr>
+            <w:tcW w:type="dxa" w:w="1800"/>
+            <w:tcMar>
+              <w:top w:w="80" w:type="dxa"/>
+              <w:bottom w:w="80" w:type="dxa"/>
+              <w:start w:w="120" w:type="dxa"/>
+              <w:end w:w="120" w:type="dxa"/>
+            </w:tcMar>
+            <w:vAlign w:val="center"/>
+          </w:tcPr>
+          <w:p>
+            <w:pPr>
+              <w:jc w:val="left"/>
+            </w:pPr>
+            <w:r>
+              <w:rPr>
+                <w:rFonts w:ascii="Calibri" w:hAnsi="Calibri" w:eastAsia="微软雅黑"/>
+                <w:color w:val="20251F"/>
+                <w:sz w:val="20"/>
+              </w:rPr>
+              <w:t>地址补充</w:t>
+            </w:r>
+          </w:p>
+        </w:tc>
+        <w:tc>
+          <w:tcPr>
+            <w:tcW w:type="dxa" w:w="5200"/>
+            <w:tcMar>
+              <w:top w:w="80" w:type="dxa"/>
+              <w:bottom w:w="80" w:type="dxa"/>
+              <w:start w:w="120" w:type="dxa"/>
+              <w:end w:w="120" w:type="dxa"/>
+            </w:tcMar>
+            <w:vAlign w:val="center"/>
+          </w:tcPr>
+          <w:p>
+            <w:pPr>
+              <w:jc w:val="left"/>
+            </w:pPr>
+            <w:r>
+              <w:rPr>
+                <w:rFonts w:ascii="Calibri" w:hAnsi="Calibri" w:eastAsia="微软雅黑"/>
+                <w:color w:val="20251F"/>
+                <w:sz w:val="20"/>
+              </w:rPr>
+              <w:t>Add repository URL to deliverables：在 README 和报告首页补充 GitHub 仓库地址。</w:t>
+            </w:r>
+          </w:p>
+        </w:tc>
+        <w:tc>
+          <w:tcPr>
+            <w:tcW w:type="dxa" w:w="2360"/>
+            <w:tcMar>
+              <w:top w:w="80" w:type="dxa"/>
+              <w:bottom w:w="80" w:type="dxa"/>
+              <w:start w:w="120" w:type="dxa"/>
+              <w:end w:w="120" w:type="dxa"/>
+            </w:tcMar>
+            <w:vAlign w:val="center"/>
+          </w:tcPr>
+          <w:p>
+            <w:pPr>
+              <w:jc w:val="left"/>
+            </w:pPr>
+            <w:r>
+              <w:rPr>
+                <w:rFonts w:ascii="Calibri" w:hAnsi="Calibri" w:eastAsia="微软雅黑"/>
+                <w:color w:val="20251F"/>
+                <w:sz w:val="20"/>
+              </w:rPr>
+              <w:t>Git 提交 6e048a9。</w:t>
+            </w:r>
+          </w:p>
+        </w:tc>
+      </w:tr>
+      <w:tr>
+        <w:tc>
+          <w:tcPr>
+            <w:tcW w:type="dxa" w:w="1800"/>
+            <w:tcMar>
+              <w:top w:w="80" w:type="dxa"/>
+              <w:bottom w:w="80" w:type="dxa"/>
+              <w:start w:w="120" w:type="dxa"/>
+              <w:end w:w="120" w:type="dxa"/>
+            </w:tcMar>
+            <w:vAlign w:val="center"/>
+          </w:tcPr>
+          <w:p>
+            <w:pPr>
+              <w:jc w:val="left"/>
+            </w:pPr>
+            <w:r>
+              <w:rPr>
+                <w:rFonts w:ascii="Calibri" w:hAnsi="Calibri" w:eastAsia="微软雅黑"/>
+                <w:color w:val="20251F"/>
+                <w:sz w:val="20"/>
+              </w:rPr>
+              <w:t>证据截图</w:t>
+            </w:r>
+          </w:p>
+        </w:tc>
+        <w:tc>
+          <w:tcPr>
+            <w:tcW w:type="dxa" w:w="5200"/>
+            <w:tcMar>
+              <w:top w:w="80" w:type="dxa"/>
+              <w:bottom w:w="80" w:type="dxa"/>
+              <w:start w:w="120" w:type="dxa"/>
+              <w:end w:w="120" w:type="dxa"/>
+            </w:tcMar>
+            <w:vAlign w:val="center"/>
+          </w:tcPr>
+          <w:p>
+            <w:pPr>
+              <w:jc w:val="left"/>
+            </w:pPr>
+            <w:r>
+              <w:rPr>
+                <w:rFonts w:ascii="Calibri" w:hAnsi="Calibri" w:eastAsia="微软雅黑"/>
+                <w:color w:val="20251F"/>
+                <w:sz w:val="20"/>
+              </w:rPr>
+              <w:t>Add GitHub evidence screenshots to report：报告附录补充 GitHub 仓库和 README 地址截图。</w:t>
+            </w:r>
+          </w:p>
+        </w:tc>
+        <w:tc>
+          <w:tcPr>
+            <w:tcW w:type="dxa" w:w="2360"/>
+            <w:tcMar>
+              <w:top w:w="80" w:type="dxa"/>
+              <w:bottom w:w="80" w:type="dxa"/>
+              <w:start w:w="120" w:type="dxa"/>
+              <w:end w:w="120" w:type="dxa"/>
+            </w:tcMar>
+            <w:vAlign w:val="center"/>
+          </w:tcPr>
+          <w:p>
+            <w:pPr>
+              <w:jc w:val="left"/>
+            </w:pPr>
+            <w:r>
+              <w:rPr>
+                <w:rFonts w:ascii="Calibri" w:hAnsi="Calibri" w:eastAsia="微软雅黑"/>
+                <w:color w:val="20251F"/>
+                <w:sz w:val="20"/>
+              </w:rPr>
+              <w:t>Git 提交 3dbe1a0。</w:t>
+            </w:r>
+          </w:p>
+        </w:tc>
+      </w:tr>
+      <w:tr>
+        <w:tc>
+          <w:tcPr>
+            <w:tcW w:type="dxa" w:w="1800"/>
+            <w:tcMar>
+              <w:top w:w="80" w:type="dxa"/>
+              <w:bottom w:w="80" w:type="dxa"/>
+              <w:start w:w="120" w:type="dxa"/>
+              <w:end w:w="120" w:type="dxa"/>
+            </w:tcMar>
+            <w:vAlign w:val="center"/>
+          </w:tcPr>
+          <w:p>
+            <w:pPr>
+              <w:jc w:val="left"/>
+            </w:pPr>
+            <w:r>
+              <w:rPr>
+                <w:rFonts w:ascii="Calibri" w:hAnsi="Calibri" w:eastAsia="微软雅黑"/>
+                <w:color w:val="20251F"/>
+                <w:sz w:val="20"/>
+              </w:rPr>
+              <w:t>部署记录</w:t>
+            </w:r>
+          </w:p>
+        </w:tc>
+        <w:tc>
+          <w:tcPr>
+            <w:tcW w:type="dxa" w:w="5200"/>
+            <w:tcMar>
+              <w:top w:w="80" w:type="dxa"/>
+              <w:bottom w:w="80" w:type="dxa"/>
+              <w:start w:w="120" w:type="dxa"/>
+              <w:end w:w="120" w:type="dxa"/>
+            </w:tcMar>
+            <w:vAlign w:val="center"/>
+          </w:tcPr>
+          <w:p>
+            <w:pPr>
+              <w:jc w:val="left"/>
+            </w:pPr>
+            <w:r>
+              <w:rPr>
+                <w:rFonts w:ascii="Calibri" w:hAnsi="Calibri" w:eastAsia="微软雅黑"/>
+                <w:color w:val="20251F"/>
+                <w:sz w:val="20"/>
+              </w:rPr>
+              <w:t>整理云服务器配置、MySQL 初始化、systemd 后端服务、Nginx 代理和公网访问截图。</w:t>
+            </w:r>
+          </w:p>
+        </w:tc>
+        <w:tc>
+          <w:tcPr>
+            <w:tcW w:type="dxa" w:w="2360"/>
+            <w:tcMar>
+              <w:top w:w="80" w:type="dxa"/>
+              <w:bottom w:w="80" w:type="dxa"/>
+              <w:start w:w="120" w:type="dxa"/>
+              <w:end w:w="120" w:type="dxa"/>
+            </w:tcMar>
+            <w:vAlign w:val="center"/>
+          </w:tcPr>
+          <w:p>
+            <w:pPr>
+              <w:jc w:val="left"/>
+            </w:pPr>
+            <w:r>
+              <w:rPr>
+                <w:rFonts w:ascii="Calibri" w:hAnsi="Calibri" w:eastAsia="微软雅黑"/>
+                <w:color w:val="20251F"/>
+                <w:sz w:val="20"/>
+              </w:rPr>
+              <w:t>报告附录 B、docs/cloud_deploy_evidence.md。</w:t>
+            </w:r>
+          </w:p>
+        </w:tc>
+      </w:tr>
+      <w:tr>
+        <w:tc>
+          <w:tcPr>
+            <w:tcW w:type="dxa" w:w="1800"/>
+            <w:tcMar>
+              <w:top w:w="80" w:type="dxa"/>
+              <w:bottom w:w="80" w:type="dxa"/>
+              <w:start w:w="120" w:type="dxa"/>
+              <w:end w:w="120" w:type="dxa"/>
+            </w:tcMar>
+            <w:vAlign w:val="center"/>
+          </w:tcPr>
+          <w:p>
+            <w:pPr>
+              <w:jc w:val="left"/>
+            </w:pPr>
+            <w:r>
+              <w:rPr>
+                <w:rFonts w:ascii="Calibri" w:hAnsi="Calibri" w:eastAsia="微软雅黑"/>
+                <w:color w:val="20251F"/>
+                <w:sz w:val="20"/>
+              </w:rPr>
+              <w:t>自检记录</w:t>
+            </w:r>
+          </w:p>
+        </w:tc>
+        <w:tc>
+          <w:tcPr>
+            <w:tcW w:type="dxa" w:w="5200"/>
+            <w:tcMar>
+              <w:top w:w="80" w:type="dxa"/>
+              <w:bottom w:w="80" w:type="dxa"/>
+              <w:start w:w="120" w:type="dxa"/>
+              <w:end w:w="120" w:type="dxa"/>
+            </w:tcMar>
+            <w:vAlign w:val="center"/>
+          </w:tcPr>
+          <w:p>
+            <w:pPr>
+              <w:jc w:val="left"/>
+            </w:pPr>
+            <w:r>
+              <w:rPr>
+                <w:rFonts w:ascii="Calibri" w:hAnsi="Calibri" w:eastAsia="微软雅黑"/>
+                <w:color w:val="20251F"/>
+                <w:sz w:val="20"/>
+              </w:rPr>
+              <w:t>根据课程测评要求形成符合性检查表，标记已完成项和需人工填写项。</w:t>
+            </w:r>
+          </w:p>
+        </w:tc>
+        <w:tc>
+          <w:tcPr>
+            <w:tcW w:type="dxa" w:w="2360"/>
+            <w:tcMar>
+              <w:top w:w="80" w:type="dxa"/>
+              <w:bottom w:w="80" w:type="dxa"/>
+              <w:start w:w="120" w:type="dxa"/>
+              <w:end w:w="120" w:type="dxa"/>
+            </w:tcMar>
+            <w:vAlign w:val="center"/>
+          </w:tcPr>
+          <w:p>
+            <w:pPr>
+              <w:jc w:val="left"/>
+            </w:pPr>
+            <w:r>
+              <w:rPr>
+                <w:rFonts w:ascii="Calibri" w:hAnsi="Calibri" w:eastAsia="微软雅黑"/>
+                <w:color w:val="20251F"/>
+                <w:sz w:val="20"/>
+              </w:rPr>
+              <w:t>docs/requirements_compliance_check.md。</w:t>
             </w:r>
           </w:p>
         </w:tc>

</xml_diff>